<commit_message>
MATH1201 Unit 6: cite course videos per task and textbook sections for every claim
Co-Authored-By: Claude Opus 5.5 <noreply@anthropic.com>
</commit_message>
<xml_diff>
--- a/MATH1201_College_Algebra/Unit6_Trigonometry_I/Assignment/Unit6_Assignment_Activity.docx
+++ b/MATH1201_College_Algebra/Unit6_Trigonometry_I/Assignment/Unit6_Assignment_Activity.docx
@@ -206,7 +206,7 @@
           <w:i w:val="0"/>
           <w:sz w:val="24"/>
         </w:rPr>
-        <w:t>On the unit circle the radius is r = 1, so for a point (x, y) the six functions are defined as follows (Abramson, 2021, Sections 7.3 and 7.4):</w:t>
+        <w:t>On the unit circle the radius is r = 1, so for a point (x, y) the six functions are defined as follows (Abramson, 2021, Sections 7.3 and 7.4; Mathispower4u, 2011c):</w:t>
       </w:r>
     </w:p>
     <w:tbl>
@@ -863,7 +863,7 @@
           <w:i w:val="0"/>
           <w:sz w:val="24"/>
         </w:rPr>
-        <w:t xml:space="preserve"> (or 17π/6 radians). An angle of 510° is coterminal with 150°, since they differ by a full turn of 360°, so it ends at the same point A and has the same six function values and the same </w:t>
+        <w:t xml:space="preserve"> (or 17π/6 radians). An angle of 510° is coterminal with 150°, since they differ by a full turn of 360° (Abramson, 2021, Section 7.1), so it ends at the same point A and has the same six function values and the same </w:t>
       </w:r>
       <w:r>
         <w:rPr>
@@ -1075,7 +1075,7 @@
           <w:i w:val="0"/>
           <w:sz w:val="24"/>
         </w:rPr>
-        <w:t>The formula linking the opposite and adjacent sides is the tangent ratio (Abramson, 2021, Section 7.2):</w:t>
+        <w:t>The formula linking the opposite and adjacent sides is the tangent ratio (Abramson, 2021, Section 7.2; Mathispower4u, 2011a):</w:t>
       </w:r>
     </w:p>
     <w:p>
@@ -1352,7 +1352,7 @@
           <w:i w:val="0"/>
           <w:sz w:val="24"/>
         </w:rPr>
-        <w:t>The general forms used here are (Abramson, 2021, Sections 8.1 and 8.2):</w:t>
+        <w:t>The general forms used here are (Abramson, 2021, Sections 8.1 and 8.2; Mathispower4u, 2010):</w:t>
       </w:r>
     </w:p>
     <w:p>
@@ -2726,7 +2726,7 @@
           <w:i w:val="0"/>
           <w:sz w:val="24"/>
         </w:rPr>
-        <w:t>. The inverse cosine returns the angle in [0, π] whose cosine is Y (Abramson, 2021, Section 8.3).</w:t>
+        <w:t>. The inverse cosine returns the angle in [0, π] whose cosine is Y (Abramson, 2021, Section 8.3; Mathispower4u, 2011b).</w:t>
       </w:r>
     </w:p>
     <w:tbl>
@@ -3600,7 +3600,7 @@
           <w:i w:val="0"/>
           <w:sz w:val="24"/>
         </w:rPr>
-        <w:t>, and its graph is symmetric about the y-axis, as the points b and d in Task 3 also show. (By contrast, arccos is neither even nor odd, because arccos(-Y) = π - arccos(Y).)</w:t>
+        <w:t xml:space="preserve"> (Abramson, 2021, Section 7.4), and its graph is symmetric about the y-axis, as the points b and d in Task 3 also show. (By contrast, arccos is neither even nor odd, because arccos(-Y) = π - arccos(Y).)</w:t>
       </w:r>
     </w:p>
     <w:p>
@@ -3693,6 +3693,182 @@
             <w:sz w:val="24"/>
           </w:rPr>
           <w:t>https://openstax.org/details/books/algebra-and-trigonometry-2e</w:t>
+        </w:r>
+      </w:hyperlink>
+    </w:p>
+    <w:p>
+      <w:pPr>
+        <w:spacing w:line="360" w:lineRule="auto" w:after="0"/>
+        <w:ind w:left="720" w:hanging="720"/>
+      </w:pPr>
+      <w:r>
+        <w:rPr>
+          <w:rFonts w:ascii="Times New Roman" w:hAnsi="Times New Roman"/>
+          <w:b w:val="0"/>
+          <w:i w:val="0"/>
+          <w:sz w:val="24"/>
+        </w:rPr>
+        <w:t xml:space="preserve">Mathispower4u. (2010, May 11). </w:t>
+      </w:r>
+      <w:r>
+        <w:rPr>
+          <w:rFonts w:ascii="Times New Roman" w:hAnsi="Times New Roman"/>
+          <w:b w:val="0"/>
+          <w:i/>
+          <w:sz w:val="24"/>
+        </w:rPr>
+        <w:t>Graphing sine and cosine with transformations</w:t>
+      </w:r>
+      <w:r>
+        <w:rPr>
+          <w:rFonts w:ascii="Times New Roman" w:hAnsi="Times New Roman"/>
+          <w:b w:val="0"/>
+          <w:i w:val="0"/>
+          <w:sz w:val="24"/>
+        </w:rPr>
+        <w:t xml:space="preserve"> [Video]. YouTube. </w:t>
+      </w:r>
+      <w:hyperlink r:id="rId13">
+        <w:r>
+          <w:rPr>
+            <w:rFonts w:ascii="Times New Roman" w:hAnsi="Times New Roman"/>
+            <w:color w:val="0563C1"/>
+            <w:u w:val="single"/>
+            <w:sz w:val="24"/>
+          </w:rPr>
+          <w:t>https://www.youtube.com/watch?v=wUzARNIkH-g</w:t>
+        </w:r>
+      </w:hyperlink>
+    </w:p>
+    <w:p>
+      <w:pPr>
+        <w:spacing w:line="360" w:lineRule="auto" w:after="0"/>
+        <w:ind w:left="720" w:hanging="720"/>
+      </w:pPr>
+      <w:r>
+        <w:rPr>
+          <w:rFonts w:ascii="Times New Roman" w:hAnsi="Times New Roman"/>
+          <w:b w:val="0"/>
+          <w:i w:val="0"/>
+          <w:sz w:val="24"/>
+        </w:rPr>
+        <w:t xml:space="preserve">Mathispower4u. (2011a, May 24). </w:t>
+      </w:r>
+      <w:r>
+        <w:rPr>
+          <w:rFonts w:ascii="Times New Roman" w:hAnsi="Times New Roman"/>
+          <w:b w:val="0"/>
+          <w:i/>
+          <w:sz w:val="24"/>
+        </w:rPr>
+        <w:t>Example: Determine what trig function relates specific sides of a right triangle</w:t>
+      </w:r>
+      <w:r>
+        <w:rPr>
+          <w:rFonts w:ascii="Times New Roman" w:hAnsi="Times New Roman"/>
+          <w:b w:val="0"/>
+          <w:i w:val="0"/>
+          <w:sz w:val="24"/>
+        </w:rPr>
+        <w:t xml:space="preserve"> [Video]. YouTube. </w:t>
+      </w:r>
+      <w:hyperlink r:id="rId14">
+        <w:r>
+          <w:rPr>
+            <w:rFonts w:ascii="Times New Roman" w:hAnsi="Times New Roman"/>
+            <w:color w:val="0563C1"/>
+            <w:u w:val="single"/>
+            <w:sz w:val="24"/>
+          </w:rPr>
+          <w:t>https://www.youtube.com/watch?v=QfQYY6FsPss</w:t>
+        </w:r>
+      </w:hyperlink>
+    </w:p>
+    <w:p>
+      <w:pPr>
+        <w:spacing w:line="360" w:lineRule="auto" w:after="0"/>
+        <w:ind w:left="720" w:hanging="720"/>
+      </w:pPr>
+      <w:r>
+        <w:rPr>
+          <w:rFonts w:ascii="Times New Roman" w:hAnsi="Times New Roman"/>
+          <w:b w:val="0"/>
+          <w:i w:val="0"/>
+          <w:sz w:val="24"/>
+        </w:rPr>
+        <w:t xml:space="preserve">Mathispower4u. (2011b, June 3). </w:t>
+      </w:r>
+      <w:r>
+        <w:rPr>
+          <w:rFonts w:ascii="Times New Roman" w:hAnsi="Times New Roman"/>
+          <w:b w:val="0"/>
+          <w:i/>
+          <w:sz w:val="24"/>
+        </w:rPr>
+        <w:t>Examples: Evaluate expression involving inverse trig functions (Part 1)</w:t>
+      </w:r>
+      <w:r>
+        <w:rPr>
+          <w:rFonts w:ascii="Times New Roman" w:hAnsi="Times New Roman"/>
+          <w:b w:val="0"/>
+          <w:i w:val="0"/>
+          <w:sz w:val="24"/>
+        </w:rPr>
+        <w:t xml:space="preserve"> [Video]. YouTube. </w:t>
+      </w:r>
+      <w:hyperlink r:id="rId15">
+        <w:r>
+          <w:rPr>
+            <w:rFonts w:ascii="Times New Roman" w:hAnsi="Times New Roman"/>
+            <w:color w:val="0563C1"/>
+            <w:u w:val="single"/>
+            <w:sz w:val="24"/>
+          </w:rPr>
+          <w:t>https://www.youtube.com/watch?v=4qO0qUqBQEU</w:t>
+        </w:r>
+      </w:hyperlink>
+    </w:p>
+    <w:p>
+      <w:pPr>
+        <w:spacing w:line="360" w:lineRule="auto" w:after="0"/>
+        <w:ind w:left="720" w:hanging="720"/>
+      </w:pPr>
+      <w:r>
+        <w:rPr>
+          <w:rFonts w:ascii="Times New Roman" w:hAnsi="Times New Roman"/>
+          <w:b w:val="0"/>
+          <w:i w:val="0"/>
+          <w:sz w:val="24"/>
+        </w:rPr>
+        <w:t xml:space="preserve">Mathispower4u. (2011c, May 26). </w:t>
+      </w:r>
+      <w:r>
+        <w:rPr>
+          <w:rFonts w:ascii="Times New Roman" w:hAnsi="Times New Roman"/>
+          <w:b w:val="0"/>
+          <w:i/>
+          <w:sz w:val="24"/>
+        </w:rPr>
+        <w:t>More examples: Determining trig function values using the unit circle</w:t>
+      </w:r>
+      <w:r>
+        <w:rPr>
+          <w:rFonts w:ascii="Times New Roman" w:hAnsi="Times New Roman"/>
+          <w:b w:val="0"/>
+          <w:i w:val="0"/>
+          <w:sz w:val="24"/>
+        </w:rPr>
+        <w:t xml:space="preserve"> [Video]. YouTube. </w:t>
+      </w:r>
+      <w:hyperlink r:id="rId16">
+        <w:r>
+          <w:rPr>
+            <w:rFonts w:ascii="Times New Roman" w:hAnsi="Times New Roman"/>
+            <w:color w:val="0563C1"/>
+            <w:u w:val="single"/>
+            <w:sz w:val="24"/>
+          </w:rPr>
+          <w:t>https://www.youtube.com/watch?v=BFtqhHgXSMk</w:t>
         </w:r>
       </w:hyperlink>
     </w:p>

</xml_diff>

<commit_message>
MATH1201 Unit 6: add Task 4 GeoGebra graph (cos and arccos)
Co-Authored-By: Claude Opus 5.5 <noreply@anthropic.com>
</commit_message>
<xml_diff>
--- a/MATH1201_College_Algebra/Unit6_Trigonometry_I/Assignment/Unit6_Assignment_Activity.docx
+++ b/MATH1201_College_Algebra/Unit6_Trigonometry_I/Assignment/Unit6_Assignment_Activity.docx
@@ -3266,13 +3266,38 @@
         <w:jc w:val="center"/>
       </w:pPr>
       <w:r>
-        <w:rPr>
-          <w:rFonts w:ascii="Times New Roman" w:hAnsi="Times New Roman"/>
-          <w:b/>
-          <w:i w:val="0"/>
-          <w:sz w:val="24"/>
-        </w:rPr>
-        <w:t>[ Insert Logisim screenshot: figures/fig3_task4.png ]</w:t>
+        <w:drawing>
+          <wp:inline xmlns:a="http://schemas.openxmlformats.org/drawingml/2006/main" xmlns:pic="http://schemas.openxmlformats.org/drawingml/2006/picture">
+            <wp:extent cx="5486400" cy="3653942"/>
+            <wp:docPr id="3" name="Picture 3"/>
+            <wp:cNvGraphicFramePr>
+              <a:graphicFrameLocks noChangeAspect="1"/>
+            </wp:cNvGraphicFramePr>
+            <a:graphic>
+              <a:graphicData uri="http://schemas.openxmlformats.org/drawingml/2006/picture">
+                <pic:pic>
+                  <pic:nvPicPr>
+                    <pic:cNvPr id="0" name="fig3_task4.png"/>
+                    <pic:cNvPicPr/>
+                  </pic:nvPicPr>
+                  <pic:blipFill>
+                    <a:blip r:embed="rId12"/>
+                    <a:stretch>
+                      <a:fillRect/>
+                    </a:stretch>
+                  </pic:blipFill>
+                  <pic:spPr>
+                    <a:xfrm>
+                      <a:off x="0" y="0"/>
+                      <a:ext cx="5486400" cy="3653942"/>
+                    </a:xfrm>
+                    <a:prstGeom prst="rect"/>
+                  </pic:spPr>
+                </pic:pic>
+              </a:graphicData>
+            </a:graphic>
+          </wp:inline>
+        </w:drawing>
       </w:r>
     </w:p>
     <w:p>
@@ -3684,7 +3709,7 @@
         </w:rPr>
         <w:t xml:space="preserve"> (2nd ed.). OpenStax. </w:t>
       </w:r>
-      <w:hyperlink r:id="rId12">
+      <w:hyperlink r:id="rId13">
         <w:r>
           <w:rPr>
             <w:rFonts w:ascii="Times New Roman" w:hAnsi="Times New Roman"/>
@@ -3728,7 +3753,7 @@
         </w:rPr>
         <w:t xml:space="preserve"> [Video]. YouTube. </w:t>
       </w:r>
-      <w:hyperlink r:id="rId13">
+      <w:hyperlink r:id="rId14">
         <w:r>
           <w:rPr>
             <w:rFonts w:ascii="Times New Roman" w:hAnsi="Times New Roman"/>
@@ -3772,7 +3797,7 @@
         </w:rPr>
         <w:t xml:space="preserve"> [Video]. YouTube. </w:t>
       </w:r>
-      <w:hyperlink r:id="rId14">
+      <w:hyperlink r:id="rId15">
         <w:r>
           <w:rPr>
             <w:rFonts w:ascii="Times New Roman" w:hAnsi="Times New Roman"/>
@@ -3816,7 +3841,7 @@
         </w:rPr>
         <w:t xml:space="preserve"> [Video]. YouTube. </w:t>
       </w:r>
-      <w:hyperlink r:id="rId15">
+      <w:hyperlink r:id="rId16">
         <w:r>
           <w:rPr>
             <w:rFonts w:ascii="Times New Roman" w:hAnsi="Times New Roman"/>
@@ -3860,7 +3885,7 @@
         </w:rPr>
         <w:t xml:space="preserve"> [Video]. YouTube. </w:t>
       </w:r>
-      <w:hyperlink r:id="rId16">
+      <w:hyperlink r:id="rId17">
         <w:r>
           <w:rPr>
             <w:rFonts w:ascii="Times New Roman" w:hAnsi="Times New Roman"/>

</xml_diff>